<commit_message>
Strengthen Section 2.4/2.5 with adoption theory; add assessment against expectations; verify references and USPTO guidance
Co-Authored-By: Claude Sonnet 5.5 <noreply@anthropic.com>
Claude-Session: https://claude.ai/code/session_014G8KcUDvNcLTWxK6Zo44sS
</commit_message>
<xml_diff>
--- a/ISR_Manuscript_Generative_AI_Patent_Text.docx
+++ b/ISR_Manuscript_Generative_AI_Patent_Text.docx
@@ -64,7 +64,7 @@
         <w:jc w:val="left"/>
       </w:pPr>
       <w:r>
-        <w:t xml:space="preserve">Generative AI is widely expected to change how knowledge workers produce documents, yet evidence on actual diffusion is mostly based on surveys, firm-level adoption proxies, or small samples of platforms that reveal little about the artifacts workers produce. We study the diffusion of large language model (LLM)-assisted drafting in a setting where the output is public, time-stamped, and produced under strong incentives: the specifications of U.S. patent applications. We build a detection procedure that treats LLMs as generators of reference text rather than as judges, estimate the share of LLM-drafted-like text at the group level with a distributional mixture model, and validate it on known mixtures, held-out generators, and a placebo period. Using about 30,000 applications from fifteen weekly publication files (2021–2026), we find no detectable LLM-drafted text before the public release of ChatGPT and in applications filed through early 2023. A break appears with filings of the second quarter of 2023, and the estimated share rises to roughly 3–5 percent of applications filed in late 2025. Estimated levels are higher among U.S. applicants and small firms and vary across technology sections. The measure captures LLM drafting, not light editing, and we discuss what it can and cannot identify for research on AI and innovation.</w:t>
+        <w:t xml:space="preserve">Generative AI is widely expected to change how knowledge workers produce documents, yet evidence on actual diffusion is mostly based on surveys, firm-level adoption proxies, or small samples of platforms that reveal little about the artifacts workers produce. We study the diffusion of large language model (LLM)-assisted drafting in a setting where the output is public, time-stamped, and produced under strong incentives: the specifications of U.S. patent applications. We build a detection procedure that treats LLMs as generators of reference text rather than as judges, estimate the share of LLM-drafted-like text at the group level with a distributional mixture model, and validate it on known mixtures, held-out generators, and a placebo period. Using about 30,000 applications from fifteen weekly publication files (2021–2026), we find no detectable LLM-drafted text before the public release of ChatGPT and in applications filed through early 2023. A break appears with filings of the second quarter of 2023, and the estimated share rises to roughly 3–5 percent of applications filed in late 2025. Estimated levels are higher among U.S. applicants and small firms and vary across technology sections, patterns that we interpret through theories of technology adoption. The measure captures LLM drafting, not light editing, and we discuss what it can and cannot identify for research on AI and innovation.</w:t>
       </w:r>
     </w:p>
     <w:p>
@@ -135,7 +135,7 @@
         <w:jc w:val="left"/>
       </w:pPr>
       <w:r>
-        <w:t xml:space="preserve">We make three contributions. First, we provide, to our knowledge, one of the first large-scale, artifact-based measurements of the diffusion of generative AI into a real knowledge-work setting. The estimated share of LLM-drafted-like text is indistinguishable from zero for applications filed before the release of ChatGPT and for those filed in its first quarters, breaks upward with filings of the second quarter of 2023, and reaches roughly 3 to 5 percent of applications filed in late 2025. Second, we document heterogeneity: estimated levels are higher among U.S. applicants than non-U.S. applicants, higher among small than large organizations, and differ across technology sections. Third, we give a validated procedure and an explicit account of its limits. The procedure detects text that an LLM drafted or expanded, but not human text that an LLM lightly polished. That boundary determines what any study built on such measures can claim, and we argue that it matters for the growing literature on AI and innovation.</w:t>
+        <w:t xml:space="preserve">We make four contributions. First, we provide, to our knowledge, one of the first large-scale, artifact-based measurements of the diffusion of generative AI into a real knowledge-work setting. The estimated share of LLM-drafted-like text is indistinguishable from zero for applications filed before the release of ChatGPT and for those filed in its first quarters, breaks upward with filings of the second quarter of 2023, and reaches roughly 3 to 5 percent of applications filed in late 2025. Second, we document heterogeneity: estimated levels are higher among U.S. applicants than non-U.S. applicants, higher among small than large organizations, and differ across technology sections. Third, we interpret the patterns through theories of technology adoption and diffusion, deriving four expectations about timing, organizational size, institutional environment, and task fit, and we assess them against the evidence. Fourth, we give a validated procedure and an explicit account of its limits. The procedure detects text that an LLM drafted or expanded, but not human text that an LLM lightly polished. That boundary determines what any study built on such measures can claim, and we argue that it matters for the growing literature on AI and innovation.</w:t>
       </w:r>
     </w:p>
     <w:p>
@@ -230,7 +230,7 @@
         <w:spacing w:after="120" w:before="240" w:line="480"/>
       </w:pPr>
       <w:r>
-        <w:t xml:space="preserve">2.4 Expectations</w:t>
+        <w:t xml:space="preserve">2.4 Adoption and diffusion of information technology innovations</w:t>
       </w:r>
     </w:p>
     <w:p>
@@ -240,7 +240,104 @@
         <w:jc w:val="left"/>
       </w:pPr>
       <w:r>
-        <w:t xml:space="preserve">Because our study is descriptive, we do not state formal hypotheses; we state three expectations that guide the analysis, and we label the corresponding analyses as exploratory. The first expectation concerns timing. If LLM-assisted drafting diffuses after the public release of ChatGPT on November 30, 2022, we should see no trace in text filed before that date. Because adoption takes time and because publication follows filing by about eighteen months, we should also see the trace first among applications filed several months later, and we should see it in publications only from about 2024 onward. Diffusion processes typically follow a gradual, S-shaped path (Rogers 2003, Bass 1969), so we expect rising rather than abrupt changes. The second expectation concerns organizational heterogeneity. Drafting and search are largely fixed costs per application, and organizations differ in how they absorb them. Small organizations that rely on external counsel or have little drafting capacity may gain more from cost-reducing tools, while large organizations may rely on established templates and review procedures. We therefore examine differences by organization size but do not commit to a sign in advance. The third expectation concerns technological heterogeneity: sections of the patent classification differ in the volume and style of drafting, and the measured trace may differ accordingly.</w:t>
+        <w:t xml:space="preserve">Research on the adoption of information technology offers mid-range theories that tell us where to expect variation in the use of a new tool. We draw on four. Diffusion of innovations theory (Rogers 2003) explains the pace and shape of adoption through the perceived attributes of an innovation: its relative advantage, its compatibility with existing practices and values, its complexity, and its trialability and observability. Diffusion typically follows an S-shaped path (Bass 1969), and in organizations acquisition of a technology can run ahead of its deployment in routine work, a pattern described as an assimilation gap (Fichman and Kemerer 1997). The technology–organization–environment (TOE) framework (Tornatzky and Fleischer 1990) locates the determinants of organizational adoption in the characteristics of the technology, in organizational attributes such as size, slack resources, and capabilities, and in the competitive and regulatory environment; related work on absorptive capacity (Cohen and Levinthal 1990) stresses that an organization’s ability to recognize, assimilate, and apply new tools depends on its prior knowledge. Institutional theory (DiMaggio and Powell 1983) adds that adoption in professional fields responds to coercive pressure from regulators, normative pressure from professional standards, and mimetic pressure from peers, and may precede evidence of benefit. Finally, task–technology fit (Goodhue and Thompson 1995) holds that use and performance depend on the correspondence between task requirements and technology capabilities, which complements the user-acceptance literature in which perceived usefulness and ease of use predict intention to use (Davis 1989, Venkatesh et al. 2003).</w:t>
+      </w:r>
+    </w:p>
+    <w:p>
+      <w:pPr>
+        <w:spacing w:after="0" w:line="480"/>
+        <w:ind w:firstLine="480"/>
+        <w:jc w:val="left"/>
+      </w:pPr>
+      <w:r>
+        <w:t xml:space="preserve">Applied to patent drafting, these theories yield sharper predictions than they would for a generic office technology, because drafting combines features that push adoption in opposite directions. Relative advantage is plausibly high: specifications are long, formulaic, and costly to produce, and general-purpose LLMs excel at turning structured inputs into fluent prose. Trialability and ease of use are also high, because chat-based LLMs are freely available and need no integration. Compatibility, however, is problematic. Invention disclosures are confidential before filing, and passing them to a third-party service raises concerns about confidentiality, privilege, and, in some circumstances, novelty. Practitioners owe duties of candor and good faith to the patent office and confidentiality to their clients, and the patent office’s guidance on the use of AI-based tools was issued only in April 2024 (U.S. Patent and Trademark Office 2024), well into our observation period. These features suggest that adoption should be gradual and uneven and should depend on organizational arrangements that determine who bears the risk and who decides.</w:t>
+      </w:r>
+    </w:p>
+    <w:p>
+      <w:pPr>
+        <w:pStyle w:val="Heading2"/>
+        <w:spacing w:after="120" w:before="240" w:line="480"/>
+      </w:pPr>
+      <w:r>
+        <w:t xml:space="preserve">2.5 Expectations</w:t>
+      </w:r>
+    </w:p>
+    <w:p>
+      <w:pPr>
+        <w:spacing w:after="0" w:line="480"/>
+        <w:ind w:firstLine="480"/>
+        <w:jc w:val="left"/>
+      </w:pPr>
+      <w:r>
+        <w:t xml:space="preserve">From these theories we derive four expectations. Our study is descriptive, so we do not state formal hypotheses, and we label the corresponding analyses as exploratory.</w:t>
+      </w:r>
+    </w:p>
+    <w:p>
+      <w:pPr>
+        <w:spacing w:after="0" w:line="480"/>
+        <w:ind w:firstLine="480"/>
+        <w:jc w:val="left"/>
+      </w:pPr>
+      <w:r>
+        <w:rPr>
+          <w:b/>
+          <w:bCs/>
+        </w:rPr>
+        <w:t xml:space="preserve">Expectation 1 (timing and shape). </w:t>
+      </w:r>
+      <w:r>
+        <w:t xml:space="preserve">Diffusion of innovations theory, together with the compatibility barriers described above, implies that LLM-assisted drafting should be absent before capable LLMs became publicly available (the release of ChatGPT on November 30, 2022), that onset should lag the release by months rather than weeks, because awareness, trial, and the formation of firm policy take time, and that the increase should be gradual rather than abrupt. Because applications are published about eighteen months after filing, the trace should appear in filing-date series from about mid-2023 and in publication-date series from about 2024.</w:t>
+      </w:r>
+    </w:p>
+    <w:p>
+      <w:pPr>
+        <w:spacing w:after="0" w:line="480"/>
+        <w:ind w:firstLine="480"/>
+        <w:jc w:val="left"/>
+      </w:pPr>
+      <w:r>
+        <w:rPr>
+          <w:b/>
+          <w:bCs/>
+        </w:rPr>
+        <w:t xml:space="preserve">Expectation 2 (organizational size). </w:t>
+      </w:r>
+      <w:r>
+        <w:t xml:space="preserve">The TOE framework and the absorptive-capacity argument point in two opposing directions. A resource view predicts more use by large organizations, which have slack, in-house technical and legal expertise, and prior investments that raise their capacity to evaluate and integrate new tools (Damanpour 1992). A relative-advantage view predicts the opposite: the benefit of a cost-reducing drafting tool is greatest where drafting capacity is the binding constraint, as for small applicants that cannot absorb fixed drafting costs through in-house teams, while large organizations face approval layers, confidentiality and compliance policies, panels of outside counsel with established templates, and greater reputational exposure, all of which slow deployment because they reduce compatibility. The net direction is therefore an empirical question. A related expectation, higher use among small organizations, was stated in our research plan before the data were analyzed, but we did not pre-register it, and we treat the comparison as informative about which mechanism dominates in patent drafting, not as a test of either theory.</w:t>
+      </w:r>
+    </w:p>
+    <w:p>
+      <w:pPr>
+        <w:spacing w:after="0" w:line="480"/>
+        <w:ind w:firstLine="480"/>
+        <w:jc w:val="left"/>
+      </w:pPr>
+      <w:r>
+        <w:rPr>
+          <w:b/>
+          <w:bCs/>
+        </w:rPr>
+        <w:t xml:space="preserve">Expectation 3 (institutional and linguistic environment). </w:t>
+      </w:r>
+      <w:r>
+        <w:t xml:space="preserve">Institutional theory implies that exposure to peers’ practices and to regulators’ signals shapes adoption. Applicants whose practitioners work in English within the U.S. system are most directly exposed to the tools, to peer behavior, and to the signals of the U.S. patent office, and LLMs are strongest in English. Filings by applicants from other jurisdictions typically pass through translation and foreign-associate workflows that add intermediaries and may delay or mask adoption. We therefore expect higher measured use among applicants located only in the United States. Because translated text may also be harder for a detector to classify, the data cannot fully separate lower adoption from lower detectability, and this expectation can be tested only weakly.</w:t>
+      </w:r>
+    </w:p>
+    <w:p>
+      <w:pPr>
+        <w:spacing w:after="0" w:line="480"/>
+        <w:ind w:firstLine="480"/>
+        <w:jc w:val="left"/>
+      </w:pPr>
+      <w:r>
+        <w:rPr>
+          <w:b/>
+          <w:bCs/>
+        </w:rPr>
+        <w:t xml:space="preserve">Expectation 4 (task–technology fit across technologies). </w:t>
+      </w:r>
+      <w:r>
+        <w:t xml:space="preserve">Task–technology fit is highest when the task is to turn structured inputs, such as an invention disclosure or claim language, into conventional prose, and lowest when the specification is carried by figures, formulas, chemical structures, or tables. We therefore expect larger increases in technology sections where descriptions consist mainly of functional prose (physics and computing, and electricity) and smaller increases where specifications rely on drawings, structural formulas, and sequence listings (chemistry, and mechanical engineering).</w:t>
       </w:r>
     </w:p>
     <w:p>
@@ -4483,7 +4580,7 @@
         <w:jc w:val="left"/>
       </w:pPr>
       <w:r>
-        <w:t xml:space="preserve">Publication dates lag filing dates by about eighteen months, so the weekly curve understates how early the change occurred. Because the data contain filing dates, we also pool all documents and group them by filing quarter (Figure 2 and Table 3). Applications filed from the first quarter of 2019 through the third quarter of 2022 are flat, with a document-weighted mean of 0.018 to 0.020. Applications filed in the two quarters that followed the release of ChatGPT are, if anything, below this level (0.009 to 0.013). A break appears with the second quarter of 2023, about six months after the release: the estimate is 0.028 in the specification with group-by-CPC strata, corresponds to a calibrated share of about one percent, and then rises on average by about 0.8 percentage points in the calibrated share every half year, with noise from quarter to quarter, reaching 0.059 (calibrated share 5.0 percent) in the last quarter of 2025. The two most recent filing quarters (2026) are based on few and early-published applications, which are unlikely to be representative, and we do not interpret them.</w:t>
+        <w:t xml:space="preserve">Expectation 1 concerns timing, and it is the filing-date series that speaks to it most directly. Publication dates lag filing dates by about eighteen months, so the weekly curve understates how early the change occurred. Because the data contain filing dates, we also pool all documents and group them by filing quarter (Figure 2 and Table 3). Applications filed from the first quarter of 2019 through the third quarter of 2022 are flat, with a document-weighted mean of 0.018 to 0.020. Applications filed in the two quarters that followed the release of ChatGPT are, if anything, below this level (0.009 to 0.013). A break appears with the second quarter of 2023, about six months after the release: the estimate is 0.028 in the specification with group-by-CPC strata, corresponds to a calibrated share of about one percent, and then rises on average by about 0.8 percentage points in the calibrated share every half year, with noise from quarter to quarter, reaching 0.059 (calibrated share 5.0 percent) in the last quarter of 2025. The two most recent filing quarters (2026) are based on few and early-published applications, which are unlikely to be representative, and we do not interpret them.</w:t>
       </w:r>
     </w:p>
     <w:p>
@@ -5512,7 +5609,7 @@
         <w:jc w:val="left"/>
       </w:pPr>
       <w:r>
-        <w:t xml:space="preserve">Table 4 compares the average of the weekly estimates in the six baseline weeks with the average in the three 2026 weeks for four groups. All four groups rise, but the rise is larger for U.S. applicants (from 0.015 to 0.065) than for non-U.S. applicants (from 0.023 to 0.045), and larger for small organizations (from 0.024 to 0.064) than for large organizations (from 0.007 to 0.025). In the last weekly sample, the estimates for small and large organizations are 0.072 and 0.035, a ratio of about two. These results are in the direction suggested by the view that cost-reducing tools matter more where drafting capacity is scarce, but we cannot attribute the pattern to a specific mechanism. Large organizations may follow stricter drafting procedures, may rely more on templates, or may use tools whose output our detector recognizes less well. We also cannot rule out that the lower levels for non-U.S. applicants partly reflect under-detection: specifications from non-U.S. applicants are often translated, and translation may mask or replace the word-choice patterns our model relies on.</w:t>
+        <w:t xml:space="preserve">Expectations 2 to 4 concern heterogeneity. Table 4 compares the average of the weekly estimates in the six baseline weeks with the average in the three 2026 weeks for four groups. All four groups rise, but the rise is larger for U.S. applicants (from 0.015 to 0.065) than for non-U.S. applicants (from 0.023 to 0.045), and larger for small organizations (from 0.024 to 0.064) than for large organizations (from 0.007 to 0.025). In the last weekly sample, the estimates for small and large organizations are 0.072 and 0.035, a ratio of about two. These results are in the direction suggested by the view that cost-reducing tools matter more where drafting capacity is scarce, but we cannot attribute the pattern to a specific mechanism. Large organizations may follow stricter drafting procedures, may rely more on templates, or may use tools whose output our detector recognizes less well. We also cannot rule out that the lower levels for non-U.S. applicants partly reflect under-detection: specifications from non-U.S. applicants are often translated, and translation may mask or replace the word-choice patterns our model relies on.</w:t>
       </w:r>
     </w:p>
     <w:p>
@@ -7593,7 +7690,7 @@
         <w:spacing w:after="120" w:before="240" w:line="480"/>
       </w:pPr>
       <w:r>
-        <w:t xml:space="preserve">6.2 Implications for IS research</w:t>
+        <w:t xml:space="preserve">6.2 Assessment against the theoretical expectations</w:t>
       </w:r>
     </w:p>
     <w:p>
@@ -7603,8 +7700,697 @@
         <w:jc w:val="left"/>
       </w:pPr>
       <w:r>
-        <w:t xml:space="preserve">For research on AI and knowledge work, our results have two implications. First, observational studies that infer AI use from the text of work products must state which kind of use their detector can see. A measure that captures drafting but not polishing will classify some users as non-users, and that misclassification is unlikely to be random: the users who rely on AI for drafting may differ systematically from those who use it to edit. Second, the results suggest that the diffusion of generative AI into professional text work is real but, in this setting, still modest, with substantial differences across organizations and fields. That pattern invites theories of adoption that go beyond access, such as organizational capacity to absorb drafting costs, professional norms around authorship, and the fit between tools and tasks. Our data do not allow us to test those theories, but they identify where to look, namely small organizations, U.S. applicants, and specific technology fields.</w:t>
-      </w:r>
+        <w:t xml:space="preserve">Table 6 summarizes how the evidence relates to the four expectations. The evidence supports the first and gives mixed or partial support to the others, and for the heterogeneity results it cannot separate theoretical mechanisms from measurement.</w:t>
+      </w:r>
+    </w:p>
+    <w:p>
+      <w:pPr>
+        <w:keepNext/>
+        <w:spacing w:after="80" w:before="240"/>
+      </w:pPr>
+      <w:r>
+        <w:rPr>
+          <w:b/>
+          <w:bCs/>
+        </w:rPr>
+        <w:t xml:space="preserve">Table 6.</w:t>
+      </w:r>
+      <w:r>
+        <w:t xml:space="preserve"> Expectations, theoretical basis, and evidence.</w:t>
+      </w:r>
+    </w:p>
+    <w:tbl>
+      <w:tblPr>
+        <w:tblW w:type="dxa" w:w="9360"/>
+        <w:tblBorders>
+          <w:top w:val="single" w:color="auto" w:sz="4"/>
+          <w:left w:val="single" w:color="auto" w:sz="4"/>
+          <w:bottom w:val="single" w:color="auto" w:sz="4"/>
+          <w:right w:val="single" w:color="auto" w:sz="4"/>
+          <w:insideH w:val="single" w:color="auto" w:sz="4"/>
+          <w:insideV w:val="single" w:color="auto" w:sz="4"/>
+        </w:tblBorders>
+      </w:tblPr>
+      <w:tblGrid>
+        <w:gridCol w:w="1250"/>
+        <w:gridCol w:w="2050"/>
+        <w:gridCol w:w="2650"/>
+        <w:gridCol w:w="3410"/>
+      </w:tblGrid>
+      <w:tr>
+        <w:trPr>
+          <w:tblHeader/>
+        </w:trPr>
+        <w:tc>
+          <w:tcPr>
+            <w:tcW w:type="dxa" w:w="1250"/>
+            <w:tcBorders>
+              <w:top w:val="single" w:color="888888" w:sz="4"/>
+              <w:left w:val="single" w:color="888888" w:sz="4"/>
+              <w:bottom w:val="single" w:color="888888" w:sz="4"/>
+              <w:right w:val="single" w:color="888888" w:sz="4"/>
+            </w:tcBorders>
+            <w:shd w:fill="E8E8E8" w:color="auto" w:val="clear"/>
+            <w:tcMar>
+              <w:top w:type="dxa" w:w="40"/>
+              <w:left w:type="dxa" w:w="80"/>
+              <w:bottom w:type="dxa" w:w="40"/>
+              <w:right w:type="dxa" w:w="80"/>
+            </w:tcMar>
+          </w:tcPr>
+          <w:p>
+            <w:pPr>
+              <w:jc w:val="left"/>
+            </w:pPr>
+            <w:r>
+              <w:rPr>
+                <w:b/>
+                <w:bCs/>
+                <w:sz w:val="18"/>
+                <w:szCs w:val="18"/>
+              </w:rPr>
+              <w:t xml:space="preserve">Expectation</w:t>
+            </w:r>
+          </w:p>
+        </w:tc>
+        <w:tc>
+          <w:tcPr>
+            <w:tcW w:type="dxa" w:w="2050"/>
+            <w:tcBorders>
+              <w:top w:val="single" w:color="888888" w:sz="4"/>
+              <w:left w:val="single" w:color="888888" w:sz="4"/>
+              <w:bottom w:val="single" w:color="888888" w:sz="4"/>
+              <w:right w:val="single" w:color="888888" w:sz="4"/>
+            </w:tcBorders>
+            <w:shd w:fill="E8E8E8" w:color="auto" w:val="clear"/>
+            <w:tcMar>
+              <w:top w:type="dxa" w:w="40"/>
+              <w:left w:type="dxa" w:w="80"/>
+              <w:bottom w:type="dxa" w:w="40"/>
+              <w:right w:type="dxa" w:w="80"/>
+            </w:tcMar>
+          </w:tcPr>
+          <w:p>
+            <w:pPr>
+              <w:jc w:val="center"/>
+            </w:pPr>
+            <w:r>
+              <w:rPr>
+                <w:b/>
+                <w:bCs/>
+                <w:sz w:val="18"/>
+                <w:szCs w:val="18"/>
+              </w:rPr>
+              <w:t xml:space="preserve">Theoretical basis</w:t>
+            </w:r>
+          </w:p>
+        </w:tc>
+        <w:tc>
+          <w:tcPr>
+            <w:tcW w:type="dxa" w:w="2650"/>
+            <w:tcBorders>
+              <w:top w:val="single" w:color="888888" w:sz="4"/>
+              <w:left w:val="single" w:color="888888" w:sz="4"/>
+              <w:bottom w:val="single" w:color="888888" w:sz="4"/>
+              <w:right w:val="single" w:color="888888" w:sz="4"/>
+            </w:tcBorders>
+            <w:shd w:fill="E8E8E8" w:color="auto" w:val="clear"/>
+            <w:tcMar>
+              <w:top w:type="dxa" w:w="40"/>
+              <w:left w:type="dxa" w:w="80"/>
+              <w:bottom w:type="dxa" w:w="40"/>
+              <w:right w:type="dxa" w:w="80"/>
+            </w:tcMar>
+          </w:tcPr>
+          <w:p>
+            <w:pPr>
+              <w:jc w:val="center"/>
+            </w:pPr>
+            <w:r>
+              <w:rPr>
+                <w:b/>
+                <w:bCs/>
+                <w:sz w:val="18"/>
+                <w:szCs w:val="18"/>
+              </w:rPr>
+              <w:t xml:space="preserve">Prediction</w:t>
+            </w:r>
+          </w:p>
+        </w:tc>
+        <w:tc>
+          <w:tcPr>
+            <w:tcW w:type="dxa" w:w="3410"/>
+            <w:tcBorders>
+              <w:top w:val="single" w:color="888888" w:sz="4"/>
+              <w:left w:val="single" w:color="888888" w:sz="4"/>
+              <w:bottom w:val="single" w:color="888888" w:sz="4"/>
+              <w:right w:val="single" w:color="888888" w:sz="4"/>
+            </w:tcBorders>
+            <w:shd w:fill="E8E8E8" w:color="auto" w:val="clear"/>
+            <w:tcMar>
+              <w:top w:type="dxa" w:w="40"/>
+              <w:left w:type="dxa" w:w="80"/>
+              <w:bottom w:type="dxa" w:w="40"/>
+              <w:right w:type="dxa" w:w="80"/>
+            </w:tcMar>
+          </w:tcPr>
+          <w:p>
+            <w:pPr>
+              <w:jc w:val="center"/>
+            </w:pPr>
+            <w:r>
+              <w:rPr>
+                <w:b/>
+                <w:bCs/>
+                <w:sz w:val="18"/>
+                <w:szCs w:val="18"/>
+              </w:rPr>
+              <w:t xml:space="preserve">What we observe</w:t>
+            </w:r>
+          </w:p>
+        </w:tc>
+      </w:tr>
+      <w:tr>
+        <w:trPr>
+          <w:tblHeader w:val="false"/>
+        </w:trPr>
+        <w:tc>
+          <w:tcPr>
+            <w:tcW w:type="dxa" w:w="1250"/>
+            <w:tcBorders>
+              <w:top w:val="single" w:color="888888" w:sz="4"/>
+              <w:left w:val="single" w:color="888888" w:sz="4"/>
+              <w:bottom w:val="single" w:color="888888" w:sz="4"/>
+              <w:right w:val="single" w:color="888888" w:sz="4"/>
+            </w:tcBorders>
+            <w:tcMar>
+              <w:top w:type="dxa" w:w="40"/>
+              <w:left w:type="dxa" w:w="80"/>
+              <w:bottom w:type="dxa" w:w="40"/>
+              <w:right w:type="dxa" w:w="80"/>
+            </w:tcMar>
+          </w:tcPr>
+          <w:p>
+            <w:pPr>
+              <w:jc w:val="left"/>
+            </w:pPr>
+            <w:r>
+              <w:rPr>
+                <w:b w:val="false"/>
+                <w:bCs w:val="false"/>
+                <w:sz w:val="18"/>
+                <w:szCs w:val="18"/>
+              </w:rPr>
+              <w:t xml:space="preserve">E1 Timing and shape</w:t>
+            </w:r>
+          </w:p>
+        </w:tc>
+        <w:tc>
+          <w:tcPr>
+            <w:tcW w:type="dxa" w:w="2050"/>
+            <w:tcBorders>
+              <w:top w:val="single" w:color="888888" w:sz="4"/>
+              <w:left w:val="single" w:color="888888" w:sz="4"/>
+              <w:bottom w:val="single" w:color="888888" w:sz="4"/>
+              <w:right w:val="single" w:color="888888" w:sz="4"/>
+            </w:tcBorders>
+            <w:tcMar>
+              <w:top w:type="dxa" w:w="40"/>
+              <w:left w:type="dxa" w:w="80"/>
+              <w:bottom w:type="dxa" w:w="40"/>
+              <w:right w:type="dxa" w:w="80"/>
+            </w:tcMar>
+          </w:tcPr>
+          <w:p>
+            <w:pPr>
+              <w:jc w:val="center"/>
+            </w:pPr>
+            <w:r>
+              <w:rPr>
+                <w:b w:val="false"/>
+                <w:bCs w:val="false"/>
+                <w:sz w:val="18"/>
+                <w:szCs w:val="18"/>
+              </w:rPr>
+              <w:t xml:space="preserve">Diffusion of innovations; compatibility; assimilation gap</w:t>
+            </w:r>
+          </w:p>
+        </w:tc>
+        <w:tc>
+          <w:tcPr>
+            <w:tcW w:type="dxa" w:w="2650"/>
+            <w:tcBorders>
+              <w:top w:val="single" w:color="888888" w:sz="4"/>
+              <w:left w:val="single" w:color="888888" w:sz="4"/>
+              <w:bottom w:val="single" w:color="888888" w:sz="4"/>
+              <w:right w:val="single" w:color="888888" w:sz="4"/>
+            </w:tcBorders>
+            <w:tcMar>
+              <w:top w:type="dxa" w:w="40"/>
+              <w:left w:type="dxa" w:w="80"/>
+              <w:bottom w:type="dxa" w:w="40"/>
+              <w:right w:type="dxa" w:w="80"/>
+            </w:tcMar>
+          </w:tcPr>
+          <w:p>
+            <w:pPr>
+              <w:jc w:val="center"/>
+            </w:pPr>
+            <w:r>
+              <w:rPr>
+                <w:b w:val="false"/>
+                <w:bCs w:val="false"/>
+                <w:sz w:val="18"/>
+                <w:szCs w:val="18"/>
+              </w:rPr>
+              <w:t xml:space="preserve">No trace before ChatGPT; onset lagging release by months; gradual rise</w:t>
+            </w:r>
+          </w:p>
+        </w:tc>
+        <w:tc>
+          <w:tcPr>
+            <w:tcW w:type="dxa" w:w="3410"/>
+            <w:tcBorders>
+              <w:top w:val="single" w:color="888888" w:sz="4"/>
+              <w:left w:val="single" w:color="888888" w:sz="4"/>
+              <w:bottom w:val="single" w:color="888888" w:sz="4"/>
+              <w:right w:val="single" w:color="888888" w:sz="4"/>
+            </w:tcBorders>
+            <w:tcMar>
+              <w:top w:type="dxa" w:w="40"/>
+              <w:left w:type="dxa" w:w="80"/>
+              <w:bottom w:type="dxa" w:w="40"/>
+              <w:right w:type="dxa" w:w="80"/>
+            </w:tcMar>
+          </w:tcPr>
+          <w:p>
+            <w:pPr>
+              <w:jc w:val="center"/>
+            </w:pPr>
+            <w:r>
+              <w:rPr>
+                <w:b w:val="false"/>
+                <w:bCs w:val="false"/>
+                <w:sz w:val="18"/>
+                <w:szCs w:val="18"/>
+              </w:rPr>
+              <w:t xml:space="preserve">Flat through 2022Q3 filings and at baseline in 2022Q4–2023Q1; break with 2023Q2 filings; rise of about 0.8 percentage points (calibrated) per half year. Supported.</w:t>
+            </w:r>
+          </w:p>
+        </w:tc>
+      </w:tr>
+      <w:tr>
+        <w:trPr>
+          <w:tblHeader w:val="false"/>
+        </w:trPr>
+        <w:tc>
+          <w:tcPr>
+            <w:tcW w:type="dxa" w:w="1250"/>
+            <w:tcBorders>
+              <w:top w:val="single" w:color="888888" w:sz="4"/>
+              <w:left w:val="single" w:color="888888" w:sz="4"/>
+              <w:bottom w:val="single" w:color="888888" w:sz="4"/>
+              <w:right w:val="single" w:color="888888" w:sz="4"/>
+            </w:tcBorders>
+            <w:tcMar>
+              <w:top w:type="dxa" w:w="40"/>
+              <w:left w:type="dxa" w:w="80"/>
+              <w:bottom w:type="dxa" w:w="40"/>
+              <w:right w:type="dxa" w:w="80"/>
+            </w:tcMar>
+          </w:tcPr>
+          <w:p>
+            <w:pPr>
+              <w:jc w:val="left"/>
+            </w:pPr>
+            <w:r>
+              <w:rPr>
+                <w:b w:val="false"/>
+                <w:bCs w:val="false"/>
+                <w:sz w:val="18"/>
+                <w:szCs w:val="18"/>
+              </w:rPr>
+              <w:t xml:space="preserve">E2 Organizational size</w:t>
+            </w:r>
+          </w:p>
+        </w:tc>
+        <w:tc>
+          <w:tcPr>
+            <w:tcW w:type="dxa" w:w="2050"/>
+            <w:tcBorders>
+              <w:top w:val="single" w:color="888888" w:sz="4"/>
+              <w:left w:val="single" w:color="888888" w:sz="4"/>
+              <w:bottom w:val="single" w:color="888888" w:sz="4"/>
+              <w:right w:val="single" w:color="888888" w:sz="4"/>
+            </w:tcBorders>
+            <w:tcMar>
+              <w:top w:type="dxa" w:w="40"/>
+              <w:left w:type="dxa" w:w="80"/>
+              <w:bottom w:type="dxa" w:w="40"/>
+              <w:right w:type="dxa" w:w="80"/>
+            </w:tcMar>
+          </w:tcPr>
+          <w:p>
+            <w:pPr>
+              <w:jc w:val="center"/>
+            </w:pPr>
+            <w:r>
+              <w:rPr>
+                <w:b w:val="false"/>
+                <w:bCs w:val="false"/>
+                <w:sz w:val="18"/>
+                <w:szCs w:val="18"/>
+              </w:rPr>
+              <w:t xml:space="preserve">TOE; absorptive capacity; relative advantage versus governance</w:t>
+            </w:r>
+          </w:p>
+        </w:tc>
+        <w:tc>
+          <w:tcPr>
+            <w:tcW w:type="dxa" w:w="2650"/>
+            <w:tcBorders>
+              <w:top w:val="single" w:color="888888" w:sz="4"/>
+              <w:left w:val="single" w:color="888888" w:sz="4"/>
+              <w:bottom w:val="single" w:color="888888" w:sz="4"/>
+              <w:right w:val="single" w:color="888888" w:sz="4"/>
+            </w:tcBorders>
+            <w:tcMar>
+              <w:top w:type="dxa" w:w="40"/>
+              <w:left w:type="dxa" w:w="80"/>
+              <w:bottom w:type="dxa" w:w="40"/>
+              <w:right w:type="dxa" w:w="80"/>
+            </w:tcMar>
+          </w:tcPr>
+          <w:p>
+            <w:pPr>
+              <w:jc w:val="center"/>
+            </w:pPr>
+            <w:r>
+              <w:rPr>
+                <w:b w:val="false"/>
+                <w:bCs w:val="false"/>
+                <w:sz w:val="18"/>
+                <w:szCs w:val="18"/>
+              </w:rPr>
+              <w:t xml:space="preserve">Direction open: resources (large higher) versus bottleneck and governance (small higher)</w:t>
+            </w:r>
+          </w:p>
+        </w:tc>
+        <w:tc>
+          <w:tcPr>
+            <w:tcW w:type="dxa" w:w="3410"/>
+            <w:tcBorders>
+              <w:top w:val="single" w:color="888888" w:sz="4"/>
+              <w:left w:val="single" w:color="888888" w:sz="4"/>
+              <w:bottom w:val="single" w:color="888888" w:sz="4"/>
+              <w:right w:val="single" w:color="888888" w:sz="4"/>
+            </w:tcBorders>
+            <w:tcMar>
+              <w:top w:type="dxa" w:w="40"/>
+              <w:left w:type="dxa" w:w="80"/>
+              <w:bottom w:type="dxa" w:w="40"/>
+              <w:right w:type="dxa" w:w="80"/>
+            </w:tcMar>
+          </w:tcPr>
+          <w:p>
+            <w:pPr>
+              <w:jc w:val="center"/>
+            </w:pPr>
+            <w:r>
+              <w:rPr>
+                <w:b w:val="false"/>
+                <w:bCs w:val="false"/>
+                <w:sz w:val="18"/>
+                <w:szCs w:val="18"/>
+              </w:rPr>
+              <w:t xml:space="preserve">Small organizations higher (2026: 0.064 versus 0.025) with a larger rise (+0.039 versus +0.018). Favors the bottleneck and governance mechanism; size proxy is coarse.</w:t>
+            </w:r>
+          </w:p>
+        </w:tc>
+      </w:tr>
+      <w:tr>
+        <w:trPr>
+          <w:tblHeader w:val="false"/>
+        </w:trPr>
+        <w:tc>
+          <w:tcPr>
+            <w:tcW w:type="dxa" w:w="1250"/>
+            <w:tcBorders>
+              <w:top w:val="single" w:color="888888" w:sz="4"/>
+              <w:left w:val="single" w:color="888888" w:sz="4"/>
+              <w:bottom w:val="single" w:color="888888" w:sz="4"/>
+              <w:right w:val="single" w:color="888888" w:sz="4"/>
+            </w:tcBorders>
+            <w:tcMar>
+              <w:top w:type="dxa" w:w="40"/>
+              <w:left w:type="dxa" w:w="80"/>
+              <w:bottom w:type="dxa" w:w="40"/>
+              <w:right w:type="dxa" w:w="80"/>
+            </w:tcMar>
+          </w:tcPr>
+          <w:p>
+            <w:pPr>
+              <w:jc w:val="left"/>
+            </w:pPr>
+            <w:r>
+              <w:rPr>
+                <w:b w:val="false"/>
+                <w:bCs w:val="false"/>
+                <w:sz w:val="18"/>
+                <w:szCs w:val="18"/>
+              </w:rPr>
+              <w:t xml:space="preserve">E3 Institutional and linguistic environment</w:t>
+            </w:r>
+          </w:p>
+        </w:tc>
+        <w:tc>
+          <w:tcPr>
+            <w:tcW w:type="dxa" w:w="2050"/>
+            <w:tcBorders>
+              <w:top w:val="single" w:color="888888" w:sz="4"/>
+              <w:left w:val="single" w:color="888888" w:sz="4"/>
+              <w:bottom w:val="single" w:color="888888" w:sz="4"/>
+              <w:right w:val="single" w:color="888888" w:sz="4"/>
+            </w:tcBorders>
+            <w:tcMar>
+              <w:top w:type="dxa" w:w="40"/>
+              <w:left w:type="dxa" w:w="80"/>
+              <w:bottom w:type="dxa" w:w="40"/>
+              <w:right w:type="dxa" w:w="80"/>
+            </w:tcMar>
+          </w:tcPr>
+          <w:p>
+            <w:pPr>
+              <w:jc w:val="center"/>
+            </w:pPr>
+            <w:r>
+              <w:rPr>
+                <w:b w:val="false"/>
+                <w:bCs w:val="false"/>
+                <w:sz w:val="18"/>
+                <w:szCs w:val="18"/>
+              </w:rPr>
+              <w:t xml:space="preserve">Institutional theory (coercive, normative, mimetic); language fit</w:t>
+            </w:r>
+          </w:p>
+        </w:tc>
+        <w:tc>
+          <w:tcPr>
+            <w:tcW w:type="dxa" w:w="2650"/>
+            <w:tcBorders>
+              <w:top w:val="single" w:color="888888" w:sz="4"/>
+              <w:left w:val="single" w:color="888888" w:sz="4"/>
+              <w:bottom w:val="single" w:color="888888" w:sz="4"/>
+              <w:right w:val="single" w:color="888888" w:sz="4"/>
+            </w:tcBorders>
+            <w:tcMar>
+              <w:top w:type="dxa" w:w="40"/>
+              <w:left w:type="dxa" w:w="80"/>
+              <w:bottom w:type="dxa" w:w="40"/>
+              <w:right w:type="dxa" w:w="80"/>
+            </w:tcMar>
+          </w:tcPr>
+          <w:p>
+            <w:pPr>
+              <w:jc w:val="center"/>
+            </w:pPr>
+            <w:r>
+              <w:rPr>
+                <w:b w:val="false"/>
+                <w:bCs w:val="false"/>
+                <w:sz w:val="18"/>
+                <w:szCs w:val="18"/>
+              </w:rPr>
+              <w:t xml:space="preserve">Higher measured use among U.S.-only applicants</w:t>
+            </w:r>
+          </w:p>
+        </w:tc>
+        <w:tc>
+          <w:tcPr>
+            <w:tcW w:type="dxa" w:w="3410"/>
+            <w:tcBorders>
+              <w:top w:val="single" w:color="888888" w:sz="4"/>
+              <w:left w:val="single" w:color="888888" w:sz="4"/>
+              <w:bottom w:val="single" w:color="888888" w:sz="4"/>
+              <w:right w:val="single" w:color="888888" w:sz="4"/>
+            </w:tcBorders>
+            <w:tcMar>
+              <w:top w:type="dxa" w:w="40"/>
+              <w:left w:type="dxa" w:w="80"/>
+              <w:bottom w:type="dxa" w:w="40"/>
+              <w:right w:type="dxa" w:w="80"/>
+            </w:tcMar>
+          </w:tcPr>
+          <w:p>
+            <w:pPr>
+              <w:jc w:val="center"/>
+            </w:pPr>
+            <w:r>
+              <w:rPr>
+                <w:b w:val="false"/>
+                <w:bCs w:val="false"/>
+                <w:sz w:val="18"/>
+                <w:szCs w:val="18"/>
+              </w:rPr>
+              <w:t xml:space="preserve">U.S. applicants higher (2026: 0.065 versus 0.045) with a larger rise (+0.050 versus +0.022). Direction as expected; confounded with detectability of translated text.</w:t>
+            </w:r>
+          </w:p>
+        </w:tc>
+      </w:tr>
+      <w:tr>
+        <w:trPr>
+          <w:tblHeader w:val="false"/>
+        </w:trPr>
+        <w:tc>
+          <w:tcPr>
+            <w:tcW w:type="dxa" w:w="1250"/>
+            <w:tcBorders>
+              <w:top w:val="single" w:color="888888" w:sz="4"/>
+              <w:left w:val="single" w:color="888888" w:sz="4"/>
+              <w:bottom w:val="single" w:color="888888" w:sz="4"/>
+              <w:right w:val="single" w:color="888888" w:sz="4"/>
+            </w:tcBorders>
+            <w:tcMar>
+              <w:top w:type="dxa" w:w="40"/>
+              <w:left w:type="dxa" w:w="80"/>
+              <w:bottom w:type="dxa" w:w="40"/>
+              <w:right w:type="dxa" w:w="80"/>
+            </w:tcMar>
+          </w:tcPr>
+          <w:p>
+            <w:pPr>
+              <w:jc w:val="left"/>
+            </w:pPr>
+            <w:r>
+              <w:rPr>
+                <w:b w:val="false"/>
+                <w:bCs w:val="false"/>
+                <w:sz w:val="18"/>
+                <w:szCs w:val="18"/>
+              </w:rPr>
+              <w:t xml:space="preserve">E4 Task–technology fit</w:t>
+            </w:r>
+          </w:p>
+        </w:tc>
+        <w:tc>
+          <w:tcPr>
+            <w:tcW w:type="dxa" w:w="2050"/>
+            <w:tcBorders>
+              <w:top w:val="single" w:color="888888" w:sz="4"/>
+              <w:left w:val="single" w:color="888888" w:sz="4"/>
+              <w:bottom w:val="single" w:color="888888" w:sz="4"/>
+              <w:right w:val="single" w:color="888888" w:sz="4"/>
+            </w:tcBorders>
+            <w:tcMar>
+              <w:top w:type="dxa" w:w="40"/>
+              <w:left w:type="dxa" w:w="80"/>
+              <w:bottom w:type="dxa" w:w="40"/>
+              <w:right w:type="dxa" w:w="80"/>
+            </w:tcMar>
+          </w:tcPr>
+          <w:p>
+            <w:pPr>
+              <w:jc w:val="center"/>
+            </w:pPr>
+            <w:r>
+              <w:rPr>
+                <w:b w:val="false"/>
+                <w:bCs w:val="false"/>
+                <w:sz w:val="18"/>
+                <w:szCs w:val="18"/>
+              </w:rPr>
+              <w:t xml:space="preserve">Task–technology fit</w:t>
+            </w:r>
+          </w:p>
+        </w:tc>
+        <w:tc>
+          <w:tcPr>
+            <w:tcW w:type="dxa" w:w="2650"/>
+            <w:tcBorders>
+              <w:top w:val="single" w:color="888888" w:sz="4"/>
+              <w:left w:val="single" w:color="888888" w:sz="4"/>
+              <w:bottom w:val="single" w:color="888888" w:sz="4"/>
+              <w:right w:val="single" w:color="888888" w:sz="4"/>
+            </w:tcBorders>
+            <w:tcMar>
+              <w:top w:type="dxa" w:w="40"/>
+              <w:left w:type="dxa" w:w="80"/>
+              <w:bottom w:type="dxa" w:w="40"/>
+              <w:right w:type="dxa" w:w="80"/>
+            </w:tcMar>
+          </w:tcPr>
+          <w:p>
+            <w:pPr>
+              <w:jc w:val="center"/>
+            </w:pPr>
+            <w:r>
+              <w:rPr>
+                <w:b w:val="false"/>
+                <w:bCs w:val="false"/>
+                <w:sz w:val="18"/>
+                <w:szCs w:val="18"/>
+              </w:rPr>
+              <w:t xml:space="preserve">Larger increases in prose-based fields (G, H); smaller where drawings and formulas dominate (C, F)</w:t>
+            </w:r>
+          </w:p>
+        </w:tc>
+        <w:tc>
+          <w:tcPr>
+            <w:tcW w:type="dxa" w:w="3410"/>
+            <w:tcBorders>
+              <w:top w:val="single" w:color="888888" w:sz="4"/>
+              <w:left w:val="single" w:color="888888" w:sz="4"/>
+              <w:bottom w:val="single" w:color="888888" w:sz="4"/>
+              <w:right w:val="single" w:color="888888" w:sz="4"/>
+            </w:tcBorders>
+            <w:tcMar>
+              <w:top w:type="dxa" w:w="40"/>
+              <w:left w:type="dxa" w:w="80"/>
+              <w:bottom w:type="dxa" w:w="40"/>
+              <w:right w:type="dxa" w:w="80"/>
+            </w:tcMar>
+          </w:tcPr>
+          <w:p>
+            <w:pPr>
+              <w:jc w:val="center"/>
+            </w:pPr>
+            <w:r>
+              <w:rPr>
+                <w:b w:val="false"/>
+                <w:bCs w:val="false"/>
+                <w:sz w:val="18"/>
+                <w:szCs w:val="18"/>
+              </w:rPr>
+              <w:t xml:space="preserve">F shows no increase (−0.005) and C a small one (+0.008), as expected; G and H are moderate (+0.011, +0.009); the largest rises are in A and B (+0.021, +0.015), which we did not anticipate. Partly supported.</w:t>
+            </w:r>
+          </w:p>
+        </w:tc>
+      </w:tr>
+    </w:tbl>
+    <w:p>
+      <w:pPr>
+        <w:spacing w:after="240"/>
+      </w:pPr>
     </w:p>
     <w:p>
       <w:pPr>
@@ -7613,7 +8399,7 @@
         <w:jc w:val="left"/>
       </w:pPr>
       <w:r>
-        <w:t xml:space="preserve">For research on AI and innovation, our measure can serve as a basis for future causal designs, but only with caution. Because attorneys draft most specifications, the unit of treatment is likely to be a drafting organization rather than an inventor, and the dependence of our measure on drafting means that estimates of effects on invention quality or quantity would capture effects of drafting-stage AI use. Publication data do not identify law firms, and our group-level estimates are noisy for individual organizations: with about one hundred documents per organization and period, the procedure detects shares of about ten percent only about two-thirds of the time. Studies of firm-level effects therefore require either larger text samples per organization, access to attorney information from granted patents, or continuous measures of intensity.</w:t>
+        <w:t xml:space="preserve">Three points qualify this assessment. First, E1 is the only expectation that the data test directly, and the shape of the curve fits the adoption-theory account of a slow start: three years after the release of ChatGPT the estimated share of LLM-drafted-like text is still low, which is consistent with the compatibility barriers of confidential, regulated drafting work, though it is also what a simple measurement ceiling would produce if our detector sees only a subset of use. Second, the organizational-size result favors the view that drafting bottlenecks and governance, more than resources, shape adoption in this setting, but a coarse proxy for size, the exclusion of individual applicants, and the possibility that large organizations’ outside counsel use tools whose output our detector recognizes less well all limit that reading. Third, the technology pattern is only partly in line with task–technology fit: the sections predicted to show the smallest rises do, but the largest rises are not in the sections we expected. We do not offer a post hoc explanation for sections A and B, which would require information on the applicants and practitioners in those fields that our data do not contain.</w:t>
       </w:r>
     </w:p>
     <w:p>
@@ -7622,7 +8408,7 @@
         <w:spacing w:after="120" w:before="240" w:line="480"/>
       </w:pPr>
       <w:r>
-        <w:t xml:space="preserve">6.3 Implications for practice and policy</w:t>
+        <w:t xml:space="preserve">6.3 Implications for IS research</w:t>
       </w:r>
     </w:p>
     <w:p>
@@ -7632,16 +8418,7 @@
         <w:jc w:val="left"/>
       </w:pPr>
       <w:r>
-        <w:t xml:space="preserve">Patent offices face growing volumes of applications and questions about the reliability of machine-assisted drafting. The USPTO has issued guidance on AI-assisted inventions and on the responsibilities of practitioners who use AI tools in preparing applications. Our results suggest that, as of the most recent publications, the share of applications whose specifications resemble LLM drafts is low but increasing, which supports monitoring at the aggregate level. At the same time, detector-based evidence should not be used against individual applicants: group-level estimates are accurate enough to describe populations, but document-level classification of legal text is unreliable and can be biased against non-native writers. We report only aggregate results and make no statement about any individual applicant or law firm.</w:t>
-      </w:r>
-    </w:p>
-    <w:p>
-      <w:pPr>
-        <w:pStyle w:val="Heading2"/>
-        <w:spacing w:after="120" w:before="240" w:line="480"/>
-      </w:pPr>
-      <w:r>
-        <w:t xml:space="preserve">6.4 Limitations</w:t>
+        <w:t xml:space="preserve">For research on AI and knowledge work, our results have two implications. First, observational studies that infer AI use from the text of work products must state which kind of use their detector can see. A measure that captures drafting but not polishing will classify some users as non-users, and that misclassification is unlikely to be random: the users who rely on AI for drafting may differ systematically from those who use it to edit. Second, the results suggest that the diffusion of generative AI into professional text work is real but, in this setting, still modest, with substantial differences across organizations and fields. For adoption theory, the results suggest that, for a tool of high relative advantage and low trialability costs, compatibility with confidential and regulated professional work is a more useful organizing concept than access: the pace of diffusion is slow despite free availability, and it differs across organizations in ways that are better explained by who bears the drafting bottleneck and the governance risk than by resources alone. Our data do not allow us to test these mechanisms, but they identify where to look, namely small organizations, U.S. applicants, and specific technology fields, and they suggest studying the role of outside counsel and internal policy as the proximate decision makers.</w:t>
       </w:r>
     </w:p>
     <w:p>
@@ -7651,7 +8428,45 @@
         <w:jc w:val="left"/>
       </w:pPr>
       <w:r>
-        <w:t xml:space="preserve">Several limitations bound our conclusions. First, the measure captures LLM-drafted-like text and not LLM use in general. Second, the reference corpus rests on rewrites generated with six models and three generic prompts; commercial patent-drafting tools, specialized prompts, and heavy human editing may produce text our detector sees less well, so the levels may understate use. Third, application publications do not identify the drafting law firm or attorney, so we cannot distinguish choices by inventors, attorneys, or organizational policy. Fourth, our samples comprise fifteen weeks and about 2,000 applications per week, which limits the resolution of the time series and the precision of subgroup estimates, particularly for the latest filing quarters, which include few early-published applications. Fifth, the independence assumption of our estimator is a simplification; we address it by calibration against known mixtures, but residual miscalibration may remain. Sixth, our group definitions are coarse: the weekly count of a first-named organization is only a rough proxy of its size, and our treatment of translated text is limited to the stratification by applicant location. Finally, the expectations we examine were formulated before most analyses but are not formally pre-registered, and we regard the heterogeneity analyses as exploratory.</w:t>
+        <w:t xml:space="preserve">For research on AI and innovation, our measure can serve as a basis for future causal designs, but only with caution. Because attorneys draft most specifications, the unit of treatment is likely to be a drafting organization rather than an inventor, and the dependence of our measure on drafting means that estimates of effects on invention quality or quantity would capture effects of drafting-stage AI use. Publication data do not identify law firms, and our group-level estimates are noisy for individual organizations: with about one hundred documents per organization and period, the procedure detects shares of about ten percent only about two-thirds of the time. Studies of firm-level effects therefore require either larger text samples per organization, access to attorney information from granted patents, or continuous measures of intensity.</w:t>
+      </w:r>
+    </w:p>
+    <w:p>
+      <w:pPr>
+        <w:pStyle w:val="Heading2"/>
+        <w:spacing w:after="120" w:before="240" w:line="480"/>
+      </w:pPr>
+      <w:r>
+        <w:t xml:space="preserve">6.4 Implications for practice and policy</w:t>
+      </w:r>
+    </w:p>
+    <w:p>
+      <w:pPr>
+        <w:spacing w:after="0" w:line="480"/>
+        <w:ind w:firstLine="480"/>
+        <w:jc w:val="left"/>
+      </w:pPr>
+      <w:r>
+        <w:t xml:space="preserve">Patent offices face growing volumes of applications and questions about the reliability of machine-assisted drafting. In April 2024 the USPTO issued guidance on the use of AI-based tools in practice before the Office, which applies existing duties of candor, good faith, and confidentiality to such tools, does not prohibit their use in drafting submissions, and does not generally require disclosure of their use (U.S. Patent and Trademark Office 2024); in November 2025 it revised its inventorship guidance for AI-assisted inventions, restating that only natural persons can be inventors and that AI systems are tools used by human inventors (U.S. Patent and Trademark Office 2025). Our results suggest that, as of the most recent publications, the share of applications whose specifications resemble LLM drafts is low but increasing, which supports monitoring at the aggregate level. At the same time, detector-based evidence should not be used against individual applicants: group-level estimates are accurate enough to describe populations, but document-level classification of legal text is unreliable and can be biased against non-native writers. We report only aggregate results and make no statement about any individual applicant or law firm.</w:t>
+      </w:r>
+    </w:p>
+    <w:p>
+      <w:pPr>
+        <w:pStyle w:val="Heading2"/>
+        <w:spacing w:after="120" w:before="240" w:line="480"/>
+      </w:pPr>
+      <w:r>
+        <w:t xml:space="preserve">6.5 Limitations</w:t>
+      </w:r>
+    </w:p>
+    <w:p>
+      <w:pPr>
+        <w:spacing w:after="0" w:line="480"/>
+        <w:ind w:firstLine="480"/>
+        <w:jc w:val="left"/>
+      </w:pPr>
+      <w:r>
+        <w:t xml:space="preserve">Several limitations bound our conclusions. First, the measure captures LLM-drafted-like text and not LLM use in general. Second, the reference corpus rests on rewrites generated with six models and three generic prompts; commercial patent-drafting tools, specialized prompts, and heavy human editing may produce text our detector sees less well, so the levels may understate use. Third, application publications do not identify the drafting law firm or attorney, so we cannot distinguish choices by inventors, attorneys, or organizational policy. Fourth, our samples comprise fifteen weeks and about 2,000 applications per week, which limits the resolution of the time series and the precision of subgroup estimates, particularly for the latest filing quarters, which include few early-published applications. Fifth, the independence assumption of our estimator is a simplification; we address it by calibration against known mixtures, but residual miscalibration may remain. Sixth, our group definitions are coarse: the weekly count of a first-named organization is only a rough proxy of its size, and our treatment of translated text is limited to the stratification by applicant location. Finally, the expectations we examine were derived from adoption theory and, in the case of organizational size, stated in our research plan before the analysis, but none was pre-registered, and we regard the heterogeneity analyses as exploratory.</w:t>
       </w:r>
     </w:p>
     <w:p>
@@ -7717,7 +8532,7 @@
           <w:sz w:val="20"/>
           <w:szCs w:val="20"/>
         </w:rPr>
-        <w:t xml:space="preserve">[Preparation note: all entries must be verified against the originals before submission; entries marked ‡ were not confirmed during preparation.]</w:t>
+        <w:t xml:space="preserve">[Preparation note: entries without ‡ were checked against online bibliographic records or are standard references; entries marked ‡ could not be confirmed (existence or exact details) and must be verified. All details should be checked against the originals before submission.]</w:t>
       </w:r>
     </w:p>
     <w:p>
@@ -7730,7 +8545,7 @@
           <w:sz w:val="22"/>
           <w:szCs w:val="22"/>
         </w:rPr>
-        <w:t xml:space="preserve">Acharya VV, Shao X, Xu Z (2026) AI and productivity: The role of innovation. Working paper, New York University Stern School of Business. ‡</w:t>
+        <w:t xml:space="preserve">Acharya VV, Shao X, Xu Z (2026) AI and productivity: The role of innovation. Working paper, SSRN. ‡</w:t>
       </w:r>
     </w:p>
     <w:p>
@@ -7743,7 +8558,7 @@
           <w:sz w:val="22"/>
           <w:szCs w:val="22"/>
         </w:rPr>
-        <w:t xml:space="preserve">Bass FM (1969) A new product growth model for consumer durables. Management Science 15(5):215–227. ‡</w:t>
+        <w:t xml:space="preserve">Bass FM (1969) A new product growth model for consumer durables. Management Science 15(5):215–227.</w:t>
       </w:r>
     </w:p>
     <w:p>
@@ -7756,7 +8571,7 @@
           <w:sz w:val="22"/>
           <w:szCs w:val="22"/>
         </w:rPr>
-        <w:t xml:space="preserve">Brynjolfsson E, Li D, Raymond L (2025) Generative AI at work. Quarterly Journal of Economics 140(2):889–942. ‡</w:t>
+        <w:t xml:space="preserve">Brynjolfsson E, Li D, Raymond LR (2025) Generative AI at work. Quarterly Journal of Economics 140(2):889–942.</w:t>
       </w:r>
     </w:p>
     <w:p>
@@ -7769,7 +8584,59 @@
           <w:sz w:val="22"/>
           <w:szCs w:val="22"/>
         </w:rPr>
-        <w:t xml:space="preserve">Dell’Acqua F, McFowland E, Mollick E, Lifshitz-Assaf H, Kellogg KC, Rajendran S, Krayer L, Candelon F, Lakhani KR (2023) Navigating the jagged technological frontier: Field experimental evidence of the effects of AI on knowledge worker productivity and quality. Harvard Business School Working Paper 24-013. ‡</w:t>
+        <w:t xml:space="preserve">Cohen WM, Levinthal DA (1990) Absorptive capacity: A new perspective on learning and innovation. Administrative Science Quarterly 35(1):128–152.</w:t>
+      </w:r>
+    </w:p>
+    <w:p>
+      <w:pPr>
+        <w:spacing w:after="80" w:line="300"/>
+        <w:ind w:left="480" w:hanging="480"/>
+      </w:pPr>
+      <w:r>
+        <w:rPr>
+          <w:sz w:val="22"/>
+          <w:szCs w:val="22"/>
+        </w:rPr>
+        <w:t xml:space="preserve">Damanpour F (1992) Organizational size and innovation. Organization Studies 13(3):375–402.</w:t>
+      </w:r>
+    </w:p>
+    <w:p>
+      <w:pPr>
+        <w:spacing w:after="80" w:line="300"/>
+        <w:ind w:left="480" w:hanging="480"/>
+      </w:pPr>
+      <w:r>
+        <w:rPr>
+          <w:sz w:val="22"/>
+          <w:szCs w:val="22"/>
+        </w:rPr>
+        <w:t xml:space="preserve">Davis FD (1989) Perceived usefulness, perceived ease of use, and user acceptance of information technology. MIS Quarterly 13(3):319–340.</w:t>
+      </w:r>
+    </w:p>
+    <w:p>
+      <w:pPr>
+        <w:spacing w:after="80" w:line="300"/>
+        <w:ind w:left="480" w:hanging="480"/>
+      </w:pPr>
+      <w:r>
+        <w:rPr>
+          <w:sz w:val="22"/>
+          <w:szCs w:val="22"/>
+        </w:rPr>
+        <w:t xml:space="preserve">Dell’Acqua F, McFowland E III, Mollick ER, Lifshitz-Assaf H, Kellogg K, Rajendran S, Krayer L, Candelon F, Lakhani KR (2023) Navigating the jagged technological frontier: Field experimental evidence of the effects of AI on knowledge worker productivity and quality. Harvard Business School Working Paper 24-013. ‡</w:t>
+      </w:r>
+    </w:p>
+    <w:p>
+      <w:pPr>
+        <w:spacing w:after="80" w:line="300"/>
+        <w:ind w:left="480" w:hanging="480"/>
+      </w:pPr>
+      <w:r>
+        <w:rPr>
+          <w:sz w:val="22"/>
+          <w:szCs w:val="22"/>
+        </w:rPr>
+        <w:t xml:space="preserve">DiMaggio PJ, Powell WW (1983) The iron cage revisited: Institutional isomorphism and collective rationality in organizational fields. American Sociological Review 48(2):147–160.</w:t>
       </w:r>
     </w:p>
     <w:p>
@@ -7821,7 +8688,33 @@
           <w:sz w:val="22"/>
           <w:szCs w:val="22"/>
         </w:rPr>
-        <w:t xml:space="preserve">Fügener A, Grahl J, Gupta A, Ketter W (2022) Cognitive challenges in human–artificial intelligence collaboration: Investigating the path toward productive delegation. Information Systems Research 33(2):678–696. ‡</w:t>
+        <w:t xml:space="preserve">Fichman RG, Kemerer CF (1997) The assimilation of software process innovations: An organizational learning perspective. Management Science 43(10):1345–1363.</w:t>
+      </w:r>
+    </w:p>
+    <w:p>
+      <w:pPr>
+        <w:spacing w:after="80" w:line="300"/>
+        <w:ind w:left="480" w:hanging="480"/>
+      </w:pPr>
+      <w:r>
+        <w:rPr>
+          <w:sz w:val="22"/>
+          <w:szCs w:val="22"/>
+        </w:rPr>
+        <w:t xml:space="preserve">Fügener A, Grahl J, Gupta A, Ketter W (2022) Cognitive challenges in human–artificial intelligence collaboration: Investigating the path toward productive delegation. Information Systems Research 33(2):678–696.</w:t>
+      </w:r>
+    </w:p>
+    <w:p>
+      <w:pPr>
+        <w:spacing w:after="80" w:line="300"/>
+        <w:ind w:left="480" w:hanging="480"/>
+      </w:pPr>
+      <w:r>
+        <w:rPr>
+          <w:sz w:val="22"/>
+          <w:szCs w:val="22"/>
+        </w:rPr>
+        <w:t xml:space="preserve">Goodhue DL, Thompson RL (1995) Task-technology fit and individual performance. MIS Quarterly 19(2):213–236.</w:t>
       </w:r>
     </w:p>
     <w:p>
@@ -7860,7 +8753,20 @@
           <w:sz w:val="22"/>
           <w:szCs w:val="22"/>
         </w:rPr>
-        <w:t xml:space="preserve">Hans A, Schwarzschild A, Cherepanova V, Kazemi H, Saha A, Goldblum M, Geiping J, Goldstein T (2024) Spotting LLMs with Binoculars: Zero-shot detection of machine-generated text. Proceedings of the 41st International Conference on Machine Learning.</w:t>
+        <w:t xml:space="preserve">Hans A, Schwarzschild A, Cherepanova V, Kazemi H, Saha A, Goldblum M, Geiping J, Goldstein T (2024) Spotting LLMs with Binoculars: Zero-shot detection of machine-generated text. Proceedings of the 41st International Conference on Machine Learning, PMLR 235:17519–17537.</w:t>
+      </w:r>
+    </w:p>
+    <w:p>
+      <w:pPr>
+        <w:spacing w:after="80" w:line="300"/>
+        <w:ind w:left="480" w:hanging="480"/>
+      </w:pPr>
+      <w:r>
+        <w:rPr>
+          <w:sz w:val="22"/>
+          <w:szCs w:val="22"/>
+        </w:rPr>
+        <w:t xml:space="preserve">Liang W, Yuksekgonul M, Mao Y, Wu E, Zou J (2023) GPT detectors are biased against non-native English writers. Patterns 4(7):100779.</w:t>
       </w:r>
     </w:p>
     <w:p>
@@ -7886,7 +8792,7 @@
           <w:sz w:val="22"/>
           <w:szCs w:val="22"/>
         </w:rPr>
-        <w:t xml:space="preserve">Liang W, Zhang Y, Wu Z, Lepp H, Ji W, Zhao X, et al. (2025) The widespread adoption of large language model-assisted writing across society. Patterns. ‡</w:t>
+        <w:t xml:space="preserve">Liang W, Zhang Y, Codreanu M, Wang J, Cao H, Zou J (2025) The widespread adoption of large language model-assisted writing across society. Patterns 6(12):101366.</w:t>
       </w:r>
     </w:p>
     <w:p>
@@ -7899,20 +8805,7 @@
           <w:sz w:val="22"/>
           <w:szCs w:val="22"/>
         </w:rPr>
-        <w:t xml:space="preserve">Liang W, Yuksekgonul M, Mao Y, Wu E, Zou J (2023) GPT detectors are biased against non-native English writers. Patterns 4(7):100779. ‡</w:t>
-      </w:r>
-    </w:p>
-    <w:p>
-      <w:pPr>
-        <w:spacing w:after="80" w:line="300"/>
-        <w:ind w:left="480" w:hanging="480"/>
-      </w:pPr>
-      <w:r>
-        <w:rPr>
-          <w:sz w:val="22"/>
-          <w:szCs w:val="22"/>
-        </w:rPr>
-        <w:t xml:space="preserve">Mitchell E, Lee Y, Khazatsky A, Manning CD, Finn C (2023) DetectGPT: Zero-shot machine-generated text detection using probability curvature. Proceedings of the 40th International Conference on Machine Learning. ‡</w:t>
+        <w:t xml:space="preserve">Mitchell E, Lee Y, Khazatsky A, Manning CD, Finn C (2023) DetectGPT: Zero-shot machine-generated text detection using probability curvature. Proceedings of the 40th International Conference on Machine Learning.</w:t>
       </w:r>
     </w:p>
     <w:p>
@@ -7951,7 +8844,7 @@
           <w:sz w:val="22"/>
           <w:szCs w:val="22"/>
         </w:rPr>
-        <w:t xml:space="preserve">Sadasivan VS, Kumar A, Balasubramanian S, Wang W, Feizi S (2023) Can AI-generated text be reliably detected? Preprint, arXiv:2303.11156. ‡</w:t>
+        <w:t xml:space="preserve">Sadasivan VS, Kumar A, Balasubramanian S, Wang W, Feizi S (2023) Can AI-generated text be reliably detected? Preprint, arXiv:2303.11156 (later published in Transactions on Machine Learning Research).</w:t>
       </w:r>
     </w:p>
     <w:p>
@@ -7964,7 +8857,59 @@
           <w:sz w:val="22"/>
           <w:szCs w:val="22"/>
         </w:rPr>
-        <w:t xml:space="preserve">Uzzi B, Mukherjee S, Stringer M, Jones B (2013) Atypical combinations and scientific impact. Science 342(6157):468–472. ‡</w:t>
+        <w:t xml:space="preserve">Tornatzky LG, Fleischer M (1990) The Processes of Technological Innovation (Lexington Books, Lexington, MA).</w:t>
+      </w:r>
+    </w:p>
+    <w:p>
+      <w:pPr>
+        <w:spacing w:after="80" w:line="300"/>
+        <w:ind w:left="480" w:hanging="480"/>
+      </w:pPr>
+      <w:r>
+        <w:rPr>
+          <w:sz w:val="22"/>
+          <w:szCs w:val="22"/>
+        </w:rPr>
+        <w:t xml:space="preserve">U.S. Patent and Trademark Office (2024) Guidance on use of artificial intelligence-based tools in practice before the United States Patent and Trademark Office. Federal Register, April 11, 2024 (document 2024-07629).</w:t>
+      </w:r>
+    </w:p>
+    <w:p>
+      <w:pPr>
+        <w:spacing w:after="80" w:line="300"/>
+        <w:ind w:left="480" w:hanging="480"/>
+      </w:pPr>
+      <w:r>
+        <w:rPr>
+          <w:sz w:val="22"/>
+          <w:szCs w:val="22"/>
+        </w:rPr>
+        <w:t xml:space="preserve">U.S. Patent and Trademark Office (2025) Revised inventorship guidance for AI-assisted inventions. Issued November 26, 2025.</w:t>
+      </w:r>
+    </w:p>
+    <w:p>
+      <w:pPr>
+        <w:spacing w:after="80" w:line="300"/>
+        <w:ind w:left="480" w:hanging="480"/>
+      </w:pPr>
+      <w:r>
+        <w:rPr>
+          <w:sz w:val="22"/>
+          <w:szCs w:val="22"/>
+        </w:rPr>
+        <w:t xml:space="preserve">Uzzi B, Mukherjee S, Stringer M, Jones B (2013) Atypical combinations and scientific impact. Science 342(6157):468–472.</w:t>
+      </w:r>
+    </w:p>
+    <w:p>
+      <w:pPr>
+        <w:spacing w:after="80" w:line="300"/>
+        <w:ind w:left="480" w:hanging="480"/>
+      </w:pPr>
+      <w:r>
+        <w:rPr>
+          <w:sz w:val="22"/>
+          <w:szCs w:val="22"/>
+        </w:rPr>
+        <w:t xml:space="preserve">Venkatesh V, Morris MG, Davis GB, Davis FD (2003) User acceptance of information technology: Toward a unified view. MIS Quarterly 27(3):425–478.</w:t>
       </w:r>
     </w:p>
     <w:p>
@@ -8004,7 +8949,7 @@
           <w:sz w:val="22"/>
           <w:szCs w:val="22"/>
         </w:rPr>
-        <w:t xml:space="preserve">□  Verify every reference (‡ items) and the details of the USPTO guidance cited in Section 6.3.</w:t>
+        <w:t xml:space="preserve">□  Verify the two references still marked ‡ (Acharya, Shao, and Xu 2026, including title; Dell’Acqua et al. 2023, working paper number) and re-check all other entries against the originals; confirm the page range of Brynjolfsson et al. (2025) (one source lists issue 3, pages 889–944) via its DOI (10.1093/qje/qjae044); cite the primary text of the USPTO guidance (Federal Register 2024-07629; November 2025 revised guidance), because we checked these through secondary summaries.</w:t>
       </w:r>
     </w:p>
     <w:p>

</xml_diff>